<commit_message>
Animation fixes (dont ask about the extra random straight finish line)
</commit_message>
<xml_diff>
--- a/SE Systems Report Template - SFX 2026.docx
+++ b/SE Systems Report Template - SFX 2026.docx
@@ -1227,21 +1227,12 @@
               </w:rPr>
               <w:t xml:space="preserve">1. </w:t>
             </w:r>
-            <w:proofErr w:type="gramStart"/>
             <w:r>
               <w:rPr>
                 <w:b w:val="0"/>
                 <w:bCs/>
               </w:rPr>
-              <w:t>Customers(</w:t>
-            </w:r>
-            <w:proofErr w:type="gramEnd"/>
-            <w:r>
-              <w:rPr>
-                <w:b w:val="0"/>
-                <w:bCs/>
-              </w:rPr>
-              <w:t>add, delete, edit)</w:t>
+              <w:t>Customers(add, delete, edit)</w:t>
             </w:r>
           </w:p>
         </w:tc>
@@ -1468,15 +1459,7 @@
         <w:t xml:space="preserve"> analyse</w:t>
       </w:r>
       <w:r>
-        <w:t xml:space="preserve"> any limitations or boundaries in which this new system will need to operate. Boundaries can include but are not limited </w:t>
-      </w:r>
-      <w:proofErr w:type="gramStart"/>
-      <w:r>
-        <w:t>to:</w:t>
-      </w:r>
-      <w:proofErr w:type="gramEnd"/>
-      <w:r>
-        <w:t xml:space="preserve"> hardware, operating systems, security concerns etc</w:t>
+        <w:t xml:space="preserve"> any limitations or boundaries in which this new system will need to operate. Boundaries can include but are not limited to: hardware, operating systems, security concerns etc</w:t>
       </w:r>
       <w:r>
         <w:rPr>
@@ -1510,13 +1493,11 @@
               <w:spacing w:before="0" w:after="160" w:line="259" w:lineRule="auto"/>
             </w:pPr>
             <w:r>
-              <w:t>The hardware that will limit us is my slow laptop</w:t>
-            </w:r>
-          </w:p>
-          <w:p>
-            <w:pPr>
-              <w:spacing w:before="0" w:after="160" w:line="259" w:lineRule="auto"/>
-            </w:pPr>
+              <w:t>Hardware: Development and hosting is constrained to a single laptop with limited RAM and processing power, meaning the server must be lightweight. Flask's built-in development server is used rather than a production WSGI server</w:t>
+            </w:r>
+            <w:r>
+              <w:t>.</w:t>
+            </w:r>
           </w:p>
           <w:p>
             <w:pPr>
@@ -2200,15 +2181,7 @@
           </w:p>
           <w:p>
             <w:r>
-              <w:t xml:space="preserve">Parallel – 2 </w:t>
-            </w:r>
-            <w:proofErr w:type="gramStart"/>
-            <w:r>
-              <w:t>task</w:t>
-            </w:r>
-            <w:proofErr w:type="gramEnd"/>
-            <w:r>
-              <w:t xml:space="preserve"> at once (multitasking)</w:t>
+              <w:t>Parallel – 2 task at once (multitasking)</w:t>
             </w:r>
           </w:p>
           <w:p>
@@ -2277,15 +2250,7 @@
         <w:t>explain</w:t>
       </w:r>
       <w:r>
-        <w:t xml:space="preserve"> the software development approach most applicable for this current project. These are normally: Waterfall, Agile and </w:t>
-      </w:r>
-      <w:proofErr w:type="spellStart"/>
-      <w:r>
-        <w:t>WAgile</w:t>
-      </w:r>
-      <w:proofErr w:type="spellEnd"/>
-      <w:r>
-        <w:t>.</w:t>
+        <w:t xml:space="preserve"> the software development approach most applicable for this current project. These are normally: Waterfall, Agile and WAgile.</w:t>
       </w:r>
     </w:p>
     <w:tbl>
@@ -2356,13 +2321,8 @@
         <w:t xml:space="preserve"> any collaborative tools used</w:t>
       </w:r>
       <w:r>
-        <w:t xml:space="preserve">. For </w:t>
-      </w:r>
-      <w:proofErr w:type="gramStart"/>
-      <w:r>
-        <w:t>example</w:t>
-      </w:r>
-      <w:proofErr w:type="gramEnd"/>
+        <w:t>. For example</w:t>
+      </w:r>
       <w:r>
         <w:t xml:space="preserve"> Repl.it, GitHub </w:t>
       </w:r>
@@ -3626,7 +3586,6 @@
                 <w:bCs/>
               </w:rPr>
             </w:pPr>
-            <w:proofErr w:type="spellStart"/>
             <w:r>
               <w:rPr>
                 <w:rFonts w:cs="Times New Roman"/>
@@ -3635,7 +3594,6 @@
               <w:lastRenderedPageBreak/>
               <w:t>Coolboy</w:t>
             </w:r>
-            <w:proofErr w:type="spellEnd"/>
           </w:p>
         </w:tc>
         <w:tc>
@@ -3786,37 +3744,12 @@
                 <w:bCs/>
               </w:rPr>
             </w:pPr>
-            <w:proofErr w:type="spellStart"/>
-            <w:r>
-              <w:rPr>
-                <w:rFonts w:cs="Times New Roman"/>
-                <w:bCs/>
-              </w:rPr>
-              <w:t>Werkzeug</w:t>
-            </w:r>
-            <w:proofErr w:type="spellEnd"/>
-            <w:r>
-              <w:rPr>
-                <w:rFonts w:cs="Times New Roman"/>
-                <w:bCs/>
-              </w:rPr>
-              <w:t xml:space="preserve"> </w:t>
-            </w:r>
-            <w:proofErr w:type="spellStart"/>
-            <w:r>
-              <w:rPr>
-                <w:rFonts w:cs="Times New Roman"/>
-                <w:bCs/>
-              </w:rPr>
-              <w:t>bcrypt</w:t>
-            </w:r>
-            <w:proofErr w:type="spellEnd"/>
-            <w:r>
-              <w:rPr>
-                <w:rFonts w:cs="Times New Roman"/>
-                <w:bCs/>
-              </w:rPr>
-              <w:t xml:space="preserve"> hash of the user's password</w:t>
+            <w:r>
+              <w:rPr>
+                <w:rFonts w:cs="Times New Roman"/>
+                <w:bCs/>
+              </w:rPr>
+              <w:t>Werkzeug bcrypt hash of the user's password</w:t>
             </w:r>
           </w:p>
         </w:tc>
@@ -3843,23 +3776,7 @@
                 <w:rFonts w:cs="Times New Roman"/>
                 <w:bCs/>
               </w:rPr>
-              <w:t>"pbkdf</w:t>
-            </w:r>
-            <w:proofErr w:type="gramStart"/>
-            <w:r>
-              <w:rPr>
-                <w:rFonts w:cs="Times New Roman"/>
-                <w:bCs/>
-              </w:rPr>
-              <w:t>2:sha256:…</w:t>
-            </w:r>
-            <w:proofErr w:type="gramEnd"/>
-            <w:r>
-              <w:rPr>
-                <w:rFonts w:cs="Times New Roman"/>
-                <w:bCs/>
-              </w:rPr>
-              <w:t>"</w:t>
+              <w:t>"pbkdf2:sha256:…"</w:t>
             </w:r>
           </w:p>
         </w:tc>
@@ -4084,14 +4001,12 @@
                 <w:bCs/>
               </w:rPr>
             </w:pPr>
-            <w:proofErr w:type="spellStart"/>
             <w:r>
               <w:rPr>
                 <w:bCs/>
               </w:rPr>
               <w:t>Created_at</w:t>
             </w:r>
-            <w:proofErr w:type="spellEnd"/>
           </w:p>
         </w:tc>
         <w:tc>
@@ -4202,33 +4117,8 @@
                 <w:rFonts w:cs="Times New Roman"/>
                 <w:bCs/>
               </w:rPr>
-              <w:t xml:space="preserve">Records when account created </w:t>
-            </w:r>
-            <w:proofErr w:type="spellStart"/>
-            <w:r>
-              <w:rPr>
-                <w:rFonts w:cs="Times New Roman"/>
-                <w:bCs/>
-              </w:rPr>
-              <w:t>utc</w:t>
-            </w:r>
-            <w:proofErr w:type="spellEnd"/>
-            <w:r>
-              <w:rPr>
-                <w:rFonts w:cs="Times New Roman"/>
-                <w:bCs/>
-              </w:rPr>
-              <w:t xml:space="preserve"> timestamp </w:t>
-            </w:r>
-            <w:proofErr w:type="spellStart"/>
-            <w:r>
-              <w:rPr>
-                <w:rFonts w:cs="Times New Roman"/>
-                <w:bCs/>
-              </w:rPr>
-              <w:t>tingy</w:t>
-            </w:r>
-            <w:proofErr w:type="spellEnd"/>
+              <w:t>Records when account created utc timestamp tingy</w:t>
+            </w:r>
           </w:p>
         </w:tc>
         <w:tc>
@@ -9635,7 +9525,7 @@
       <w:rPr>
         <w:noProof/>
       </w:rPr>
-      <w:t>May-26</w:t>
+      <w:t>Jun-26</w:t>
     </w:r>
     <w:r>
       <w:fldChar w:fldCharType="end"/>
@@ -9701,7 +9591,7 @@
       <w:rPr>
         <w:noProof/>
       </w:rPr>
-      <w:t>May-26</w:t>
+      <w:t>Jun-26</w:t>
     </w:r>
     <w:r>
       <w:fldChar w:fldCharType="end"/>
@@ -9914,7 +9804,6 @@
     <w:lvl w:ilvl="0">
       <w:start w:val="1"/>
       <w:numFmt w:val="bullet"/>
-      <w:pStyle w:val="ListBullet"/>
       <w:lvlText w:val=""/>
       <w:lvlJc w:val="left"/>
       <w:pPr>
@@ -14587,7 +14476,12 @@
 </file>
 
 <file path=customXml/item2.xml><?xml version="1.0" encoding="utf-8"?>
-<b:Sources xmlns:b="http://schemas.openxmlformats.org/officeDocument/2006/bibliography" xmlns="http://schemas.openxmlformats.org/officeDocument/2006/bibliography" SelectedStyle="\APASixthEditionOfficeOnline.xsl" StyleName="APA" Version="6"/>
+<?mso-contentType ?>
+<FormTemplates xmlns="http://schemas.microsoft.com/sharepoint/v3/contenttype/forms">
+  <Display>DocumentLibraryForm</Display>
+  <Edit>DocumentLibraryForm</Edit>
+  <New>DocumentLibraryForm</New>
+</FormTemplates>
 </file>
 
 <file path=customXml/item3.xml><?xml version="1.0" encoding="utf-8"?>
@@ -14618,12 +14512,7 @@
 </file>
 
 <file path=customXml/item4.xml><?xml version="1.0" encoding="utf-8"?>
-<?mso-contentType ?>
-<FormTemplates xmlns="http://schemas.microsoft.com/sharepoint/v3/contenttype/forms">
-  <Display>DocumentLibraryForm</Display>
-  <Edit>DocumentLibraryForm</Edit>
-  <New>DocumentLibraryForm</New>
-</FormTemplates>
+<b:Sources xmlns:b="http://schemas.openxmlformats.org/officeDocument/2006/bibliography" xmlns="http://schemas.openxmlformats.org/officeDocument/2006/bibliography" SelectedStyle="\APASixthEditionOfficeOnline.xsl" StyleName="APA" Version="6"/>
 </file>
 
 <file path=customXml/itemProps1.xml><?xml version="1.0" encoding="utf-8"?>
@@ -14646,9 +14535,9 @@
 </file>
 
 <file path=customXml/itemProps2.xml><?xml version="1.0" encoding="utf-8"?>
-<ds:datastoreItem xmlns:ds="http://schemas.openxmlformats.org/officeDocument/2006/customXml" ds:itemID="{97A468D1-1B31-45A8-8DC4-712D94174877}">
+<ds:datastoreItem xmlns:ds="http://schemas.openxmlformats.org/officeDocument/2006/customXml" ds:itemID="{610393E5-DC4B-43F1-8BC3-DA0B5D917AE0}">
   <ds:schemaRefs>
-    <ds:schemaRef ds:uri="http://schemas.openxmlformats.org/officeDocument/2006/bibliography"/>
+    <ds:schemaRef ds:uri="http://schemas.microsoft.com/sharepoint/v3/contenttype/forms"/>
   </ds:schemaRefs>
 </ds:datastoreItem>
 </file>
@@ -14665,9 +14554,9 @@
 </file>
 
 <file path=customXml/itemProps4.xml><?xml version="1.0" encoding="utf-8"?>
-<ds:datastoreItem xmlns:ds="http://schemas.openxmlformats.org/officeDocument/2006/customXml" ds:itemID="{610393E5-DC4B-43F1-8BC3-DA0B5D917AE0}">
+<ds:datastoreItem xmlns:ds="http://schemas.openxmlformats.org/officeDocument/2006/customXml" ds:itemID="{97A468D1-1B31-45A8-8DC4-712D94174877}">
   <ds:schemaRefs>
-    <ds:schemaRef ds:uri="http://schemas.microsoft.com/sharepoint/v3/contenttype/forms"/>
+    <ds:schemaRef ds:uri="http://schemas.openxmlformats.org/officeDocument/2006/bibliography"/>
   </ds:schemaRefs>
 </ds:datastoreItem>
 </file>
</xml_diff>